<commit_message>
update report: k20 DONE (0.94) added to §6.1 density table
</commit_message>
<xml_diff>
--- a/docs/experiment-log/完整实验记录_2026-08-11.docx
+++ b/docs/experiment-log/完整实验记录_2026-08-11.docx
@@ -3125,7 +3125,7 @@
         <w:pStyle w:val="Heading2"/>
       </w:pPr>
       <w:r>
-        <w:t>§6.1 密度扫描 k 轴完整实测结果（k=1→15 共 7 done · k20 running）</w:t>
+        <w:t>§6.1 密度扫描 k 轴完整实测结果（k=1→20 共 8 done）</w:t>
       </w:r>
     </w:p>
     <w:p>
@@ -3821,10 +3821,7 @@
           </w:tcPr>
           <w:p>
             <w:r>
-              <w:rPr>
-                <w:sz w:val="18"/>
-              </w:rPr>
-              <w:t>— (running q447/500)</w:t>
+              <w:t>0.940</w:t>
             </w:r>
           </w:p>
         </w:tc>
@@ -3834,10 +3831,7 @@
           </w:tcPr>
           <w:p>
             <w:r>
-              <w:rPr>
-                <w:sz w:val="18"/>
-              </w:rPr>
-              <w:t>—</w:t>
+              <w:t>0.834</w:t>
             </w:r>
           </w:p>
         </w:tc>
@@ -3847,10 +3841,7 @@
           </w:tcPr>
           <w:p>
             <w:r>
-              <w:rPr>
-                <w:sz w:val="18"/>
-              </w:rPr>
-              <w:t>—</w:t>
+              <w:t>0.608</w:t>
             </w:r>
           </w:p>
         </w:tc>
@@ -3860,10 +3851,7 @@
           </w:tcPr>
           <w:p>
             <w:r>
-              <w:rPr>
-                <w:sz w:val="18"/>
-              </w:rPr>
-              <w:t>—</w:t>
+              <w:t>+0.106</w:t>
             </w:r>
           </w:p>
         </w:tc>
@@ -3873,10 +3861,7 @@
           </w:tcPr>
           <w:p>
             <w:r>
-              <w:rPr>
-                <w:sz w:val="18"/>
-              </w:rPr>
-              <w:t>running</w:t>
+              <w:t>done · 扩展</w:t>
             </w:r>
           </w:p>
         </w:tc>

</xml_diff>

<commit_message>
report + figures + dashboard + live data (2026-08-16)
</commit_message>
<xml_diff>
--- a/docs/experiment-log/完整实验记录_2026-08-11.docx
+++ b/docs/experiment-log/完整实验记录_2026-08-11.docx
@@ -3367,10 +3367,7 @@
           </w:tcPr>
           <w:p>
             <w:r>
-              <w:rPr>
-                <w:sz w:val="18"/>
-              </w:rPr>
-              <w:t>—</w:t>
+              <w:t>0.592</w:t>
             </w:r>
           </w:p>
         </w:tc>
@@ -3867,6 +3864,323 @@
         </w:tc>
       </w:tr>
     </w:tbl>
+    <w:p>
+      <w:r>
+        <w:rPr>
+          <w:b/>
+          <w:sz w:val="23"/>
+        </w:rPr>
+        <w:t>密度扫描核心发现（k 轴，Ẇ=1.0，N=500）</w:t>
+      </w:r>
+    </w:p>
+    <w:p>
+      <w:r>
+        <w:t>① 护城河铁证：全部 8 个 k 值的集体精度（0.902–0.950）始终远大于最强单体（0.834）与纯投票（0.59–0.61），集体与纯投票差距约 0.33 且与 k 无关——这是“协作合成 ≠ 多数投票”的硬证据。</w:t>
+      </w:r>
+    </w:p>
+    <w:p>
+      <w:r>
+        <w:t>② 非单调与最优 k：集体精度在 k=10–12 达到峰值 0.950，k=7（0.928）、k=15（0.936）、k=20（0.940）均低于峰值；k=20 并未优于 k=10，否定“专家越多越好”，与方程“过密回落”的定性预言方向一致。</w:t>
+      </w:r>
+    </w:p>
+    <w:p>
+      <w:r>
+        <w:t>③ 诚实边界：图5 显示 k10/k12 峰值与 k15/k20 之差约 1pp，小于 N=500 二项 95% CI（约 ±2.7pp），非单调方向一致但幅度未超出统计噪声，需更大 N 或更密 k 采样确认。</w:t>
+      </w:r>
+    </w:p>
+    <w:p>
+      <w:r>
+        <w:t>④ 涌现判据：G_anchor（集体−最强单体）全程稳定 +0.09~+0.12，与 k 弱相关，表明增益来自跨层合成机制而非单纯增加专家节点。</w:t>
+      </w:r>
+    </w:p>
+    <w:p>
+      <w:pPr>
+        <w:jc w:val="center"/>
+      </w:pPr>
+      <w:r>
+        <w:drawing>
+          <wp:inline xmlns:a="http://schemas.openxmlformats.org/drawingml/2006/main" xmlns:pic="http://schemas.openxmlformats.org/drawingml/2006/picture">
+            <wp:extent cx="5486400" cy="3169920"/>
+            <wp:docPr id="11" name="Picture 11"/>
+            <wp:cNvGraphicFramePr>
+              <a:graphicFrameLocks noChangeAspect="1"/>
+            </wp:cNvGraphicFramePr>
+            <a:graphic>
+              <a:graphicData uri="http://schemas.openxmlformats.org/drawingml/2006/picture">
+                <pic:pic>
+                  <pic:nvPicPr>
+                    <pic:cNvPr id="0" name="fig1_k_axis_overview.png"/>
+                    <pic:cNvPicPr/>
+                  </pic:nvPicPr>
+                  <pic:blipFill>
+                    <a:blip r:embed="rId19"/>
+                    <a:stretch>
+                      <a:fillRect/>
+                    </a:stretch>
+                  </pic:blipFill>
+                  <pic:spPr>
+                    <a:xfrm>
+                      <a:off x="0" y="0"/>
+                      <a:ext cx="5486400" cy="3169920"/>
+                    </a:xfrm>
+                    <a:prstGeom prst="rect"/>
+                  </pic:spPr>
+                </pic:pic>
+              </a:graphicData>
+            </a:graphic>
+          </wp:inline>
+        </w:drawing>
+      </w:r>
+    </w:p>
+    <w:p>
+      <w:pPr>
+        <w:jc w:val="center"/>
+      </w:pPr>
+      <w:r>
+        <w:rPr>
+          <w:color w:val="5F5E5A"/>
+          <w:sz w:val="18"/>
+        </w:rPr>
+        <w:t>图1 · k 轴总览：护城河三线与集体精度非单调</w:t>
+      </w:r>
+    </w:p>
+    <w:p>
+      <w:pPr>
+        <w:jc w:val="center"/>
+      </w:pPr>
+      <w:r>
+        <w:drawing>
+          <wp:inline xmlns:a="http://schemas.openxmlformats.org/drawingml/2006/main" xmlns:pic="http://schemas.openxmlformats.org/drawingml/2006/picture">
+            <wp:extent cx="5486400" cy="2294313"/>
+            <wp:docPr id="12" name="Picture 12"/>
+            <wp:cNvGraphicFramePr>
+              <a:graphicFrameLocks noChangeAspect="1"/>
+            </wp:cNvGraphicFramePr>
+            <a:graphic>
+              <a:graphicData uri="http://schemas.openxmlformats.org/drawingml/2006/picture">
+                <pic:pic>
+                  <pic:nvPicPr>
+                    <pic:cNvPr id="0" name="fig2_node_distribution_k20.png"/>
+                    <pic:cNvPicPr/>
+                  </pic:nvPicPr>
+                  <pic:blipFill>
+                    <a:blip r:embed="rId20"/>
+                    <a:stretch>
+                      <a:fillRect/>
+                    </a:stretch>
+                  </pic:blipFill>
+                  <pic:spPr>
+                    <a:xfrm>
+                      <a:off x="0" y="0"/>
+                      <a:ext cx="5486400" cy="2294313"/>
+                    </a:xfrm>
+                    <a:prstGeom prst="rect"/>
+                  </pic:spPr>
+                </pic:pic>
+              </a:graphicData>
+            </a:graphic>
+          </wp:inline>
+        </w:drawing>
+      </w:r>
+    </w:p>
+    <w:p>
+      <w:pPr>
+        <w:jc w:val="center"/>
+      </w:pPr>
+      <w:r>
+        <w:rPr>
+          <w:color w:val="5F5E5A"/>
+          <w:sz w:val="18"/>
+        </w:rPr>
+        <w:t>图2 · k=20 节点精度分布：信息从底层汇聚到顶层</w:t>
+      </w:r>
+    </w:p>
+    <w:p>
+      <w:pPr>
+        <w:jc w:val="center"/>
+      </w:pPr>
+      <w:r>
+        <w:drawing>
+          <wp:inline xmlns:a="http://schemas.openxmlformats.org/drawingml/2006/main" xmlns:pic="http://schemas.openxmlformats.org/drawingml/2006/picture">
+            <wp:extent cx="5486400" cy="3048000"/>
+            <wp:docPr id="13" name="Picture 13"/>
+            <wp:cNvGraphicFramePr>
+              <a:graphicFrameLocks noChangeAspect="1"/>
+            </wp:cNvGraphicFramePr>
+            <a:graphic>
+              <a:graphicData uri="http://schemas.openxmlformats.org/drawingml/2006/picture">
+                <pic:pic>
+                  <pic:nvPicPr>
+                    <pic:cNvPr id="0" name="fig4_G_anchor.png"/>
+                    <pic:cNvPicPr/>
+                  </pic:nvPicPr>
+                  <pic:blipFill>
+                    <a:blip r:embed="rId21"/>
+                    <a:stretch>
+                      <a:fillRect/>
+                    </a:stretch>
+                  </pic:blipFill>
+                  <pic:spPr>
+                    <a:xfrm>
+                      <a:off x="0" y="0"/>
+                      <a:ext cx="5486400" cy="3048000"/>
+                    </a:xfrm>
+                    <a:prstGeom prst="rect"/>
+                  </pic:spPr>
+                </pic:pic>
+              </a:graphicData>
+            </a:graphic>
+          </wp:inline>
+        </w:drawing>
+      </w:r>
+    </w:p>
+    <w:p>
+      <w:pPr>
+        <w:jc w:val="center"/>
+      </w:pPr>
+      <w:r>
+        <w:rPr>
+          <w:color w:val="5F5E5A"/>
+          <w:sz w:val="18"/>
+        </w:rPr>
+        <w:t>图4 · G_anchor 恒定 vs 纯投票恒低</w:t>
+      </w:r>
+    </w:p>
+    <w:p>
+      <w:pPr>
+        <w:jc w:val="center"/>
+      </w:pPr>
+      <w:r>
+        <w:drawing>
+          <wp:inline xmlns:a="http://schemas.openxmlformats.org/drawingml/2006/main" xmlns:pic="http://schemas.openxmlformats.org/drawingml/2006/picture">
+            <wp:extent cx="5486400" cy="3227294"/>
+            <wp:docPr id="14" name="Picture 14"/>
+            <wp:cNvGraphicFramePr>
+              <a:graphicFrameLocks noChangeAspect="1"/>
+            </wp:cNvGraphicFramePr>
+            <a:graphic>
+              <a:graphicData uri="http://schemas.openxmlformats.org/drawingml/2006/picture">
+                <pic:pic>
+                  <pic:nvPicPr>
+                    <pic:cNvPr id="0" name="fig5_k_ci.png"/>
+                    <pic:cNvPicPr/>
+                  </pic:nvPicPr>
+                  <pic:blipFill>
+                    <a:blip r:embed="rId22"/>
+                    <a:stretch>
+                      <a:fillRect/>
+                    </a:stretch>
+                  </pic:blipFill>
+                  <pic:spPr>
+                    <a:xfrm>
+                      <a:off x="0" y="0"/>
+                      <a:ext cx="5486400" cy="3227294"/>
+                    </a:xfrm>
+                    <a:prstGeom prst="rect"/>
+                  </pic:spPr>
+                </pic:pic>
+              </a:graphicData>
+            </a:graphic>
+          </wp:inline>
+        </w:drawing>
+      </w:r>
+    </w:p>
+    <w:p>
+      <w:pPr>
+        <w:jc w:val="center"/>
+      </w:pPr>
+      <w:r>
+        <w:rPr>
+          <w:color w:val="5F5E5A"/>
+          <w:sz w:val="18"/>
+        </w:rPr>
+        <w:t>图5 · 非单调幅度与统计噪声边界（诚实）</w:t>
+      </w:r>
+    </w:p>
+    <w:p>
+      <w:pPr>
+        <w:pStyle w:val="Heading2"/>
+      </w:pPr>
+      <w:r>
+        <w:t>§6.2 W 轴扫描进度（进行中）</w:t>
+      </w:r>
+    </w:p>
+    <w:p>
+      <w:r>
+        <w:t>W 轴补扫于 k20 密度扫描完成后自动接力启动（固定 k=10，扫 Ẇ = 0.0 / 0.2 / 0.4 / 0.5 / 0.6 / 0.8 / 1.0 共七档，每档 N=500）。截至本记录更新：</w:t>
+      </w:r>
+    </w:p>
+    <w:p>
+      <w:r>
+        <w:t>· Ẇ=0.00 已完成（done）：集体准确率 0.948；</w:t>
+      </w:r>
+    </w:p>
+    <w:p>
+      <w:r>
+        <w:t>· Ẇ=0.20 进行中（running，q≈165/500）：当前均值 0.9515；</w:t>
+      </w:r>
+    </w:p>
+    <w:p>
+      <w:r>
+        <w:t>· 方程预言 M(Ẇ) 在 Wc≈0.45–0.62 出现唯一内峰、过密回落；当前实测低 Ẇ（0.0–0.2）高于高 Ẇ（1.0=0.950），方向与“过密回落”一致，但峰位是否落在预言区间待七档全出钉死（预计约 2026-08-18 至 08-19）。</w:t>
+      </w:r>
+    </w:p>
+    <w:p>
+      <w:r>
+        <w:t>注意：k 轴扫描将 Ẇ 写死 1.0，仅测一个 W 点，所有判定均标注“非线性项未贡献、不能判涌现”；W 轴全部七档完成前，M(Ẇ) 单峰与 Wc 未被直接实测验证。</w:t>
+      </w:r>
+    </w:p>
+    <w:p>
+      <w:pPr>
+        <w:jc w:val="center"/>
+      </w:pPr>
+      <w:r>
+        <w:drawing>
+          <wp:inline xmlns:a="http://schemas.openxmlformats.org/drawingml/2006/main" xmlns:pic="http://schemas.openxmlformats.org/drawingml/2006/picture">
+            <wp:extent cx="5486400" cy="3429000"/>
+            <wp:docPr id="15" name="Picture 15"/>
+            <wp:cNvGraphicFramePr>
+              <a:graphicFrameLocks noChangeAspect="1"/>
+            </wp:cNvGraphicFramePr>
+            <a:graphic>
+              <a:graphicData uri="http://schemas.openxmlformats.org/drawingml/2006/picture">
+                <pic:pic>
+                  <pic:nvPicPr>
+                    <pic:cNvPr id="0" name="fig3_w_axis_progress.png"/>
+                    <pic:cNvPicPr/>
+                  </pic:nvPicPr>
+                  <pic:blipFill>
+                    <a:blip r:embed="rId23"/>
+                    <a:stretch>
+                      <a:fillRect/>
+                    </a:stretch>
+                  </pic:blipFill>
+                  <pic:spPr>
+                    <a:xfrm>
+                      <a:off x="0" y="0"/>
+                      <a:ext cx="5486400" cy="3429000"/>
+                    </a:xfrm>
+                    <a:prstGeom prst="rect"/>
+                  </pic:spPr>
+                </pic:pic>
+              </a:graphicData>
+            </a:graphic>
+          </wp:inline>
+        </w:drawing>
+      </w:r>
+    </w:p>
+    <w:p>
+      <w:pPr>
+        <w:jc w:val="center"/>
+      </w:pPr>
+      <w:r>
+        <w:rPr>
+          <w:color w:val="5F5E5A"/>
+          <w:sz w:val="18"/>
+        </w:rPr>
+        <w:t>图3 · W 轴 M(Ẇ) 扫描进度（进行中 2/7 档）</w:t>
+      </w:r>
+    </w:p>
     <w:p>
       <w:r>
         <w:t>说明：① 集体准确率全程贴 0.93–0.95 平台（k1=0.902 略低因单列无层级聚合），G_anchor 恒为正(+0.07~+0.12)；② committee0(纯投票)仅 0.59–0.61，远低于集体且被最强单体 0.834 封顶 → 增益非投票；③ k≥5 未见随 k 单调上升，落在修正后方程 Wc≈0.45–0.62 的峰后平台段，越峰回落需 W 轴扫描钉死；④ k20 在跑，完成后补录。</w:t>

</xml_diff>

<commit_message>
docs+fix: 完整实验记录补入8/17失误记录(§6.3+M1-M5)与Ẇ轴已测值; 修复run_wc_scan.py漏import argparse
</commit_message>
<xml_diff>
--- a/docs/experiment-log/完整实验记录_2026-08-11.docx
+++ b/docs/experiment-log/完整实验记录_2026-08-11.docx
@@ -2943,6 +2943,254 @@
           </w:p>
         </w:tc>
       </w:tr>
+      <w:tr>
+        <w:tc>
+          <w:tcPr>
+            <w:tcW w:type="dxa" w:w="2160"/>
+          </w:tcPr>
+          <w:p>
+            <w:r/>
+            <w:r>
+              <w:rPr>
+                <w:b w:val="0"/>
+                <w:sz w:val="18"/>
+              </w:rPr>
+              <w:t>P14</w:t>
+            </w:r>
+          </w:p>
+        </w:tc>
+        <w:tc>
+          <w:tcPr>
+            <w:tcW w:type="dxa" w:w="2160"/>
+          </w:tcPr>
+          <w:p>
+            <w:r/>
+            <w:r>
+              <w:rPr>
+                <w:b w:val="0"/>
+                <w:sz w:val="18"/>
+              </w:rPr>
+              <w:t>分析误用运行态脏字段，K轴数值虚高（M1）</w:t>
+            </w:r>
+          </w:p>
+        </w:tc>
+        <w:tc>
+          <w:tcPr>
+            <w:tcW w:type="dxa" w:w="2160"/>
+          </w:tcPr>
+          <w:p>
+            <w:r/>
+            <w:r>
+              <w:rPr>
+                <w:b w:val="0"/>
+                <w:sz w:val="18"/>
+              </w:rPr>
+              <w:t>density JSON 的 collective_acc/details 被实时滚动改写且自相矛盾；v1 分析误取 details 重算→K轴 0.956–0.970（虚高~2pp）</w:t>
+            </w:r>
+          </w:p>
+        </w:tc>
+        <w:tc>
+          <w:tcPr>
+            <w:tcW w:type="dxa" w:w="2160"/>
+          </w:tcPr>
+          <w:p>
+            <w:r/>
+            <w:r>
+              <w:rPr>
+                <w:b w:val="0"/>
+                <w:sz w:val="18"/>
+              </w:rPr>
+              <w:t>以 docx §6.1 / dashboard / verify_report 三源交叉验证权威值（0.902–0.950）为准；density 裸字段不作真值（详见 §6.3 / 真值口径优先级）</w:t>
+            </w:r>
+          </w:p>
+        </w:tc>
+      </w:tr>
+      <w:tr>
+        <w:tc>
+          <w:tcPr>
+            <w:tcW w:type="dxa" w:w="2160"/>
+          </w:tcPr>
+          <w:p>
+            <w:r/>
+            <w:r>
+              <w:rPr>
+                <w:b w:val="0"/>
+                <w:sz w:val="18"/>
+              </w:rPr>
+              <w:t>P15</w:t>
+            </w:r>
+          </w:p>
+        </w:tc>
+        <w:tc>
+          <w:tcPr>
+            <w:tcW w:type="dxa" w:w="2160"/>
+          </w:tcPr>
+          <w:p>
+            <w:r/>
+            <w:r>
+              <w:rPr>
+                <w:b w:val="0"/>
+                <w:sz w:val="18"/>
+              </w:rPr>
+              <w:t>k20 误判“未完”（M2）</w:t>
+            </w:r>
+          </w:p>
+        </w:tc>
+        <w:tc>
+          <w:tcPr>
+            <w:tcW w:type="dxa" w:w="2160"/>
+          </w:tcPr>
+          <w:p>
+            <w:r/>
+            <w:r>
+              <w:rPr>
+                <w:b w:val="0"/>
+                <w:sz w:val="18"/>
+              </w:rPr>
+              <w:t>所看 stage2_density_k20.json 是 P13 休眠事故中 k20 solo 被截断重跑的 running 残留，非真实状态</w:t>
+            </w:r>
+          </w:p>
+        </w:tc>
+        <w:tc>
+          <w:tcPr>
+            <w:tcW w:type="dxa" w:w="2160"/>
+          </w:tcPr>
+          <w:p>
+            <w:r/>
+            <w:r>
+              <w:rPr>
+                <w:b w:val="0"/>
+                <w:sz w:val="18"/>
+              </w:rPr>
+              <w:t>以 docx §6.1 / dashboard / 图2 的 done 结果（0.940）为准；核验须交叉多源，残留文件≠真实状态</w:t>
+            </w:r>
+          </w:p>
+        </w:tc>
+      </w:tr>
+      <w:tr>
+        <w:tc>
+          <w:tcPr>
+            <w:tcW w:type="dxa" w:w="2160"/>
+          </w:tcPr>
+          <w:p>
+            <w:r/>
+            <w:r>
+              <w:rPr>
+                <w:b w:val="0"/>
+                <w:sz w:val="18"/>
+              </w:rPr>
+              <w:t>P16</w:t>
+            </w:r>
+          </w:p>
+        </w:tc>
+        <w:tc>
+          <w:tcPr>
+            <w:tcW w:type="dxa" w:w="2160"/>
+          </w:tcPr>
+          <w:p>
+            <w:r/>
+            <w:r>
+              <w:rPr>
+                <w:b w:val="0"/>
+                <w:sz w:val="18"/>
+              </w:rPr>
+              <w:t>run_wc_scan.py 缺 import argparse 致重启崩溃（M3）</w:t>
+            </w:r>
+          </w:p>
+        </w:tc>
+        <w:tc>
+          <w:tcPr>
+            <w:tcW w:type="dxa" w:w="2160"/>
+          </w:tcPr>
+          <w:p>
+            <w:r/>
+            <w:r>
+              <w:rPr>
+                <w:b w:val="0"/>
+                <w:sz w:val="18"/>
+              </w:rPr>
+              <w:t>wc 脚本漏写 import argparse（density 脚本有），重启即 NameError</w:t>
+            </w:r>
+          </w:p>
+        </w:tc>
+        <w:tc>
+          <w:tcPr>
+            <w:tcW w:type="dxa" w:w="2160"/>
+          </w:tcPr>
+          <w:p>
+            <w:r/>
+            <w:r>
+              <w:rPr>
+                <w:b w:val="0"/>
+                <w:sz w:val="18"/>
+              </w:rPr>
+              <w:t>补 import argparse；重启成功，断点续跑（详见 §6.3）</w:t>
+            </w:r>
+          </w:p>
+        </w:tc>
+      </w:tr>
+      <w:tr>
+        <w:tc>
+          <w:tcPr>
+            <w:tcW w:type="dxa" w:w="2160"/>
+          </w:tcPr>
+          <w:p>
+            <w:r/>
+            <w:r>
+              <w:rPr>
+                <w:b w:val="0"/>
+                <w:sz w:val="18"/>
+              </w:rPr>
+              <w:t>P17</w:t>
+            </w:r>
+          </w:p>
+        </w:tc>
+        <w:tc>
+          <w:tcPr>
+            <w:tcW w:type="dxa" w:w="2160"/>
+          </w:tcPr>
+          <w:p>
+            <w:r/>
+            <w:r>
+              <w:rPr>
+                <w:b w:val="0"/>
+                <w:sz w:val="18"/>
+              </w:rPr>
+              <w:t>Ẇ轴扫描在 Ẇ=0.4 处进程中断、重启续跑（M4/M5）</w:t>
+            </w:r>
+          </w:p>
+        </w:tc>
+        <w:tc>
+          <w:tcPr>
+            <w:tcW w:type="dxa" w:w="2160"/>
+          </w:tcPr>
+          <w:p>
+            <w:r/>
+            <w:r>
+              <w:rPr>
+                <w:b w:val="0"/>
+                <w:sz w:val="18"/>
+              </w:rPr>
+              <w:t>P13 前科再现：笔记本休眠/进程崩溃带走扫描驱动；状态汇报误用滞后 live/ 镜像</w:t>
+            </w:r>
+          </w:p>
+        </w:tc>
+        <w:tc>
+          <w:tcPr>
+            <w:tcW w:type="dxa" w:w="2160"/>
+          </w:tcPr>
+          <w:p>
+            <w:r/>
+            <w:r>
+              <w:rPr>
+                <w:b w:val="0"/>
+                <w:sz w:val="18"/>
+              </w:rPr>
+              <w:t>单实例锁+探活+题级断点续跑已落地；核验以 canonical results/density/w_level_truth.json 为准；后台重启续跑中</w:t>
+            </w:r>
+          </w:p>
+        </w:tc>
+      </w:tr>
     </w:tbl>
     <w:p>
       <w:pPr/>
@@ -4112,22 +4360,642 @@
     </w:p>
     <w:p>
       <w:r>
-        <w:t>· Ẇ=0.00 已完成（done，真值由每档独立落盘的逐题 tier 记录 l1_ok 重算验证）：集体准确率 0.966；</w:t>
+        <w:t>· W 轴已验证四档（Ẇ=0.0/0.2/0.4/0.5，每档 N=500，真值由逐题 tier 记录 l1_ok 重算）：集体准确率 = 0.966 / 0.968 / 0.968 / 0.968，呈**平坦平台 ~0.967**，低Ẇ段未见内峰、未见回落。方程预言 M(Ẇ) 唯一内峰恰在 Wc≈0.45–0.62；在已完成四档（含预言峰区 0.4–0.5）实测为平坦平台，**低Ẇ段未出现预言内峰**。高Ẇ端（0.6/0.8/1.0）扫描进行中，完整 M(Ẇ) 与 Wc 待七档齐出后钉死（预计约 8/18 出曲线）。</w:t>
       </w:r>
     </w:p>
+    <w:tbl>
+      <w:tblPr>
+        <w:tblStyle w:val="LightGrid-Accent1"/>
+        <w:tblW w:type="auto" w:w="0"/>
+        <w:tblLook w:firstColumn="1" w:firstRow="1" w:lastColumn="0" w:lastRow="0" w:noHBand="0" w:noVBand="1" w:val="04A0"/>
+      </w:tblPr>
+      <w:tblGrid>
+        <w:gridCol w:w="1728"/>
+        <w:gridCol w:w="1728"/>
+        <w:gridCol w:w="1728"/>
+        <w:gridCol w:w="1728"/>
+        <w:gridCol w:w="1728"/>
+      </w:tblGrid>
+      <w:tr>
+        <w:tc>
+          <w:tcPr>
+            <w:tcW w:type="dxa" w:w="1728"/>
+          </w:tcPr>
+          <w:p>
+            <w:r/>
+            <w:r>
+              <w:rPr>
+                <w:b/>
+                <w:sz w:val="18"/>
+              </w:rPr>
+              <w:t>Ẇ (连接强度)</w:t>
+            </w:r>
+          </w:p>
+        </w:tc>
+        <w:tc>
+          <w:tcPr>
+            <w:tcW w:type="dxa" w:w="1728"/>
+          </w:tcPr>
+          <w:p>
+            <w:r/>
+            <w:r>
+              <w:rPr>
+                <w:b/>
+                <w:sz w:val="18"/>
+              </w:rPr>
+              <w:t>集体准确率</w:t>
+            </w:r>
+          </w:p>
+        </w:tc>
+        <w:tc>
+          <w:tcPr>
+            <w:tcW w:type="dxa" w:w="1728"/>
+          </w:tcPr>
+          <w:p>
+            <w:r/>
+            <w:r>
+              <w:rPr>
+                <w:b/>
+                <w:sz w:val="18"/>
+              </w:rPr>
+              <w:t>N</w:t>
+            </w:r>
+          </w:p>
+        </w:tc>
+        <w:tc>
+          <w:tcPr>
+            <w:tcW w:type="dxa" w:w="1728"/>
+          </w:tcPr>
+          <w:p>
+            <w:r/>
+            <w:r>
+              <w:rPr>
+                <w:b/>
+                <w:sz w:val="18"/>
+              </w:rPr>
+              <w:t>状态</w:t>
+            </w:r>
+          </w:p>
+        </w:tc>
+        <w:tc>
+          <w:tcPr>
+            <w:tcW w:type="dxa" w:w="1728"/>
+          </w:tcPr>
+          <w:p>
+            <w:r/>
+            <w:r>
+              <w:rPr>
+                <w:b/>
+                <w:sz w:val="18"/>
+              </w:rPr>
+              <w:t>真值来源</w:t>
+            </w:r>
+          </w:p>
+        </w:tc>
+      </w:tr>
+      <w:tr>
+        <w:tc>
+          <w:tcPr>
+            <w:tcW w:type="dxa" w:w="1728"/>
+          </w:tcPr>
+          <w:p>
+            <w:r/>
+            <w:r>
+              <w:rPr>
+                <w:b w:val="0"/>
+                <w:sz w:val="18"/>
+              </w:rPr>
+              <w:t>0.0</w:t>
+            </w:r>
+          </w:p>
+        </w:tc>
+        <w:tc>
+          <w:tcPr>
+            <w:tcW w:type="dxa" w:w="1728"/>
+          </w:tcPr>
+          <w:p>
+            <w:r/>
+            <w:r>
+              <w:rPr>
+                <w:b w:val="0"/>
+                <w:sz w:val="18"/>
+              </w:rPr>
+              <w:t>0.966</w:t>
+            </w:r>
+          </w:p>
+        </w:tc>
+        <w:tc>
+          <w:tcPr>
+            <w:tcW w:type="dxa" w:w="1728"/>
+          </w:tcPr>
+          <w:p>
+            <w:r/>
+            <w:r>
+              <w:rPr>
+                <w:b w:val="0"/>
+                <w:sz w:val="18"/>
+              </w:rPr>
+              <w:t>500</w:t>
+            </w:r>
+          </w:p>
+        </w:tc>
+        <w:tc>
+          <w:tcPr>
+            <w:tcW w:type="dxa" w:w="1728"/>
+          </w:tcPr>
+          <w:p>
+            <w:r/>
+            <w:r>
+              <w:rPr>
+                <w:b w:val="0"/>
+                <w:sz w:val="18"/>
+              </w:rPr>
+              <w:t>done（逐题 tier 重算）</w:t>
+            </w:r>
+          </w:p>
+        </w:tc>
+        <w:tc>
+          <w:tcPr>
+            <w:tcW w:type="dxa" w:w="1728"/>
+          </w:tcPr>
+          <w:p>
+            <w:r/>
+            <w:r>
+              <w:rPr>
+                <w:b w:val="0"/>
+                <w:sz w:val="18"/>
+              </w:rPr>
+              <w:t>tiers/stage2_wc_k10_cw0.00.jsonl</w:t>
+            </w:r>
+          </w:p>
+        </w:tc>
+      </w:tr>
+      <w:tr>
+        <w:tc>
+          <w:tcPr>
+            <w:tcW w:type="dxa" w:w="1728"/>
+          </w:tcPr>
+          <w:p>
+            <w:r/>
+            <w:r>
+              <w:rPr>
+                <w:b w:val="0"/>
+                <w:sz w:val="18"/>
+              </w:rPr>
+              <w:t>0.2</w:t>
+            </w:r>
+          </w:p>
+        </w:tc>
+        <w:tc>
+          <w:tcPr>
+            <w:tcW w:type="dxa" w:w="1728"/>
+          </w:tcPr>
+          <w:p>
+            <w:r/>
+            <w:r>
+              <w:rPr>
+                <w:b w:val="0"/>
+                <w:sz w:val="18"/>
+              </w:rPr>
+              <w:t>0.968</w:t>
+            </w:r>
+          </w:p>
+        </w:tc>
+        <w:tc>
+          <w:tcPr>
+            <w:tcW w:type="dxa" w:w="1728"/>
+          </w:tcPr>
+          <w:p>
+            <w:r/>
+            <w:r>
+              <w:rPr>
+                <w:b w:val="0"/>
+                <w:sz w:val="18"/>
+              </w:rPr>
+              <w:t>500</w:t>
+            </w:r>
+          </w:p>
+        </w:tc>
+        <w:tc>
+          <w:tcPr>
+            <w:tcW w:type="dxa" w:w="1728"/>
+          </w:tcPr>
+          <w:p>
+            <w:r/>
+            <w:r>
+              <w:rPr>
+                <w:b w:val="0"/>
+                <w:sz w:val="18"/>
+              </w:rPr>
+              <w:t>done</w:t>
+            </w:r>
+          </w:p>
+        </w:tc>
+        <w:tc>
+          <w:tcPr>
+            <w:tcW w:type="dxa" w:w="1728"/>
+          </w:tcPr>
+          <w:p>
+            <w:r/>
+            <w:r>
+              <w:rPr>
+                <w:b w:val="0"/>
+                <w:sz w:val="18"/>
+              </w:rPr>
+              <w:t>tiers/stage2_wc_k10_cw0.20.jsonl</w:t>
+            </w:r>
+          </w:p>
+        </w:tc>
+      </w:tr>
+      <w:tr>
+        <w:tc>
+          <w:tcPr>
+            <w:tcW w:type="dxa" w:w="1728"/>
+          </w:tcPr>
+          <w:p>
+            <w:r/>
+            <w:r>
+              <w:rPr>
+                <w:b w:val="0"/>
+                <w:sz w:val="18"/>
+              </w:rPr>
+              <w:t>0.4</w:t>
+            </w:r>
+          </w:p>
+        </w:tc>
+        <w:tc>
+          <w:tcPr>
+            <w:tcW w:type="dxa" w:w="1728"/>
+          </w:tcPr>
+          <w:p>
+            <w:r/>
+            <w:r>
+              <w:rPr>
+                <w:b w:val="0"/>
+                <w:sz w:val="18"/>
+              </w:rPr>
+              <w:t>0.968</w:t>
+            </w:r>
+          </w:p>
+        </w:tc>
+        <w:tc>
+          <w:tcPr>
+            <w:tcW w:type="dxa" w:w="1728"/>
+          </w:tcPr>
+          <w:p>
+            <w:r/>
+            <w:r>
+              <w:rPr>
+                <w:b w:val="0"/>
+                <w:sz w:val="18"/>
+              </w:rPr>
+              <w:t>500</w:t>
+            </w:r>
+          </w:p>
+        </w:tc>
+        <w:tc>
+          <w:tcPr>
+            <w:tcW w:type="dxa" w:w="1728"/>
+          </w:tcPr>
+          <w:p>
+            <w:r/>
+            <w:r>
+              <w:rPr>
+                <w:b w:val="0"/>
+                <w:sz w:val="18"/>
+              </w:rPr>
+              <w:t>done</w:t>
+            </w:r>
+          </w:p>
+        </w:tc>
+        <w:tc>
+          <w:tcPr>
+            <w:tcW w:type="dxa" w:w="1728"/>
+          </w:tcPr>
+          <w:p>
+            <w:r/>
+            <w:r>
+              <w:rPr>
+                <w:b w:val="0"/>
+                <w:sz w:val="18"/>
+              </w:rPr>
+              <w:t>tiers/stage2_wc_k10_cw0.40.jsonl</w:t>
+            </w:r>
+          </w:p>
+        </w:tc>
+      </w:tr>
+      <w:tr>
+        <w:tc>
+          <w:tcPr>
+            <w:tcW w:type="dxa" w:w="1728"/>
+          </w:tcPr>
+          <w:p>
+            <w:r/>
+            <w:r>
+              <w:rPr>
+                <w:b w:val="0"/>
+                <w:sz w:val="18"/>
+              </w:rPr>
+              <w:t>0.5</w:t>
+            </w:r>
+          </w:p>
+        </w:tc>
+        <w:tc>
+          <w:tcPr>
+            <w:tcW w:type="dxa" w:w="1728"/>
+          </w:tcPr>
+          <w:p>
+            <w:r/>
+            <w:r>
+              <w:rPr>
+                <w:b w:val="0"/>
+                <w:sz w:val="18"/>
+              </w:rPr>
+              <w:t>0.968</w:t>
+            </w:r>
+          </w:p>
+        </w:tc>
+        <w:tc>
+          <w:tcPr>
+            <w:tcW w:type="dxa" w:w="1728"/>
+          </w:tcPr>
+          <w:p>
+            <w:r/>
+            <w:r>
+              <w:rPr>
+                <w:b w:val="0"/>
+                <w:sz w:val="18"/>
+              </w:rPr>
+              <w:t>500</w:t>
+            </w:r>
+          </w:p>
+        </w:tc>
+        <w:tc>
+          <w:tcPr>
+            <w:tcW w:type="dxa" w:w="1728"/>
+          </w:tcPr>
+          <w:p>
+            <w:r/>
+            <w:r>
+              <w:rPr>
+                <w:b w:val="0"/>
+                <w:sz w:val="18"/>
+              </w:rPr>
+              <w:t>done</w:t>
+            </w:r>
+          </w:p>
+        </w:tc>
+        <w:tc>
+          <w:tcPr>
+            <w:tcW w:type="dxa" w:w="1728"/>
+          </w:tcPr>
+          <w:p>
+            <w:r/>
+            <w:r>
+              <w:rPr>
+                <w:b w:val="0"/>
+                <w:sz w:val="18"/>
+              </w:rPr>
+              <w:t>tiers/stage2_wc_k10_cw0.50.jsonl</w:t>
+            </w:r>
+          </w:p>
+        </w:tc>
+      </w:tr>
+      <w:tr>
+        <w:tc>
+          <w:tcPr>
+            <w:tcW w:type="dxa" w:w="1728"/>
+          </w:tcPr>
+          <w:p>
+            <w:r/>
+            <w:r>
+              <w:rPr>
+                <w:b w:val="0"/>
+                <w:sz w:val="18"/>
+              </w:rPr>
+              <w:t>0.6</w:t>
+            </w:r>
+          </w:p>
+        </w:tc>
+        <w:tc>
+          <w:tcPr>
+            <w:tcW w:type="dxa" w:w="1728"/>
+          </w:tcPr>
+          <w:p>
+            <w:r/>
+            <w:r>
+              <w:rPr>
+                <w:b w:val="0"/>
+                <w:sz w:val="18"/>
+              </w:rPr>
+              <w:t>—</w:t>
+            </w:r>
+          </w:p>
+        </w:tc>
+        <w:tc>
+          <w:tcPr>
+            <w:tcW w:type="dxa" w:w="1728"/>
+          </w:tcPr>
+          <w:p>
+            <w:r/>
+            <w:r>
+              <w:rPr>
+                <w:b w:val="0"/>
+                <w:sz w:val="18"/>
+              </w:rPr>
+              <w:t>500</w:t>
+            </w:r>
+          </w:p>
+        </w:tc>
+        <w:tc>
+          <w:tcPr>
+            <w:tcW w:type="dxa" w:w="1728"/>
+          </w:tcPr>
+          <w:p>
+            <w:r/>
+            <w:r>
+              <w:rPr>
+                <w:b w:val="0"/>
+                <w:sz w:val="18"/>
+              </w:rPr>
+              <w:t>扫描中（8/17 重启续跑）</w:t>
+            </w:r>
+          </w:p>
+        </w:tc>
+        <w:tc>
+          <w:tcPr>
+            <w:tcW w:type="dxa" w:w="1728"/>
+          </w:tcPr>
+          <w:p>
+            <w:r/>
+            <w:r>
+              <w:rPr>
+                <w:b w:val="0"/>
+                <w:sz w:val="18"/>
+              </w:rPr>
+              <w:t>—</w:t>
+            </w:r>
+          </w:p>
+        </w:tc>
+      </w:tr>
+      <w:tr>
+        <w:tc>
+          <w:tcPr>
+            <w:tcW w:type="dxa" w:w="1728"/>
+          </w:tcPr>
+          <w:p>
+            <w:r/>
+            <w:r>
+              <w:rPr>
+                <w:b w:val="0"/>
+                <w:sz w:val="18"/>
+              </w:rPr>
+              <w:t>0.8</w:t>
+            </w:r>
+          </w:p>
+        </w:tc>
+        <w:tc>
+          <w:tcPr>
+            <w:tcW w:type="dxa" w:w="1728"/>
+          </w:tcPr>
+          <w:p>
+            <w:r/>
+            <w:r>
+              <w:rPr>
+                <w:b w:val="0"/>
+                <w:sz w:val="18"/>
+              </w:rPr>
+              <w:t>—</w:t>
+            </w:r>
+          </w:p>
+        </w:tc>
+        <w:tc>
+          <w:tcPr>
+            <w:tcW w:type="dxa" w:w="1728"/>
+          </w:tcPr>
+          <w:p>
+            <w:r/>
+            <w:r>
+              <w:rPr>
+                <w:b w:val="0"/>
+                <w:sz w:val="18"/>
+              </w:rPr>
+              <w:t>500</w:t>
+            </w:r>
+          </w:p>
+        </w:tc>
+        <w:tc>
+          <w:tcPr>
+            <w:tcW w:type="dxa" w:w="1728"/>
+          </w:tcPr>
+          <w:p>
+            <w:r/>
+            <w:r>
+              <w:rPr>
+                <w:b w:val="0"/>
+                <w:sz w:val="18"/>
+              </w:rPr>
+              <w:t>扫描中</w:t>
+            </w:r>
+          </w:p>
+        </w:tc>
+        <w:tc>
+          <w:tcPr>
+            <w:tcW w:type="dxa" w:w="1728"/>
+          </w:tcPr>
+          <w:p>
+            <w:r/>
+            <w:r>
+              <w:rPr>
+                <w:b w:val="0"/>
+                <w:sz w:val="18"/>
+              </w:rPr>
+              <w:t>—</w:t>
+            </w:r>
+          </w:p>
+        </w:tc>
+      </w:tr>
+      <w:tr>
+        <w:tc>
+          <w:tcPr>
+            <w:tcW w:type="dxa" w:w="1728"/>
+          </w:tcPr>
+          <w:p>
+            <w:r/>
+            <w:r>
+              <w:rPr>
+                <w:b w:val="0"/>
+                <w:sz w:val="18"/>
+              </w:rPr>
+              <w:t>1.0</w:t>
+            </w:r>
+          </w:p>
+        </w:tc>
+        <w:tc>
+          <w:tcPr>
+            <w:tcW w:type="dxa" w:w="1728"/>
+          </w:tcPr>
+          <w:p>
+            <w:r/>
+            <w:r>
+              <w:rPr>
+                <w:b w:val="0"/>
+                <w:sz w:val="18"/>
+              </w:rPr>
+              <w:t>—</w:t>
+            </w:r>
+          </w:p>
+        </w:tc>
+        <w:tc>
+          <w:tcPr>
+            <w:tcW w:type="dxa" w:w="1728"/>
+          </w:tcPr>
+          <w:p>
+            <w:r/>
+            <w:r>
+              <w:rPr>
+                <w:b w:val="0"/>
+                <w:sz w:val="18"/>
+              </w:rPr>
+              <w:t>500</w:t>
+            </w:r>
+          </w:p>
+        </w:tc>
+        <w:tc>
+          <w:tcPr>
+            <w:tcW w:type="dxa" w:w="1728"/>
+          </w:tcPr>
+          <w:p>
+            <w:r/>
+            <w:r>
+              <w:rPr>
+                <w:b w:val="0"/>
+                <w:sz w:val="18"/>
+              </w:rPr>
+              <w:t>扫描中</w:t>
+            </w:r>
+          </w:p>
+        </w:tc>
+        <w:tc>
+          <w:tcPr>
+            <w:tcW w:type="dxa" w:w="1728"/>
+          </w:tcPr>
+          <w:p>
+            <w:r/>
+            <w:r>
+              <w:rPr>
+                <w:b w:val="0"/>
+                <w:sz w:val="18"/>
+              </w:rPr>
+              <w:t>—</w:t>
+            </w:r>
+          </w:p>
+        </w:tc>
+      </w:tr>
+    </w:tbl>
     <w:p>
       <w:r>
-        <w:t>· Ẇ=0.20 已完成（done，真值由逐题 tier 记录重算验证）：集体准确率 0.968；</w:t>
-      </w:r>
-    </w:p>
-    <w:p>
-      <w:r>
-        <w:t xml:space="preserve">· Ẇ=0.40 已完成（done，真值由逐题 tier 记录重算验证）：集体准确率 0.968；</w:t>
-      </w:r>
-    </w:p>
-    <w:p>
-      <w:r>
-        <w:t>· W 轴已验证四档（Ẇ=0.0/0.2/0.4/0.5，每档 N=500，真值由逐题 tier 记录 l1_ok 重算）：集体准确率 = 0.966 / 0.968 / 0.968 / 0.968，呈**平坦平台 ~0.967**，低Ẇ段未见内峰、未见回落。方程预言 M(Ẇ) 唯一内峰恰在 Wc≈0.45–0.62；在已完成四档（含预言峰区 0.4–0.5）实测为平坦平台，**低Ẇ段未出现预言内峰**。高Ẇ端（0.6/0.8/1.0）扫描进行中，完整 M(Ẇ) 与 Wc 待七档齐出后钉死（预计约 8/18 出曲线）。</w:t>
+        <w:t>已验证四档（Ẇ=0.0/0.2/0.4/0.5）集体准确率 = 0.966 / 0.968 / 0.968 / 0.968，呈平坦平台 ~0.967；低Ẇ段（含预言峰区 0.4–0.5）未见内峰、未见回落。高Ẇ端（0.6/0.8/1.0）扫描中，完整 M(Ẇ) 与 Wc 待七档齐出后钉死（预计 ~8/18 出曲线）。</w:t>
       </w:r>
     </w:p>
     <w:p>
@@ -4190,6 +5058,79 @@
     <w:p>
       <w:r>
         <w:t>说明：① 已验证四档（Ẇ=0.0/0.2/0.4/0.5）集体准确率 = 0.966/0.968/0.968/0.968，平坦平台 ~0.967，低Ẇ段无内峰无回落；② committee0（纯投票）仅 0.59–0.61，远低于集体，证伪“只是投票”；③ 高Ẇ端（0.6/0.8/1.0）扫描进行中，M(Ẇ) 完整曲线与 Wc 待七档齐出后钉死。</w:t>
+      </w:r>
+    </w:p>
+    <w:p>
+      <w:pPr>
+        <w:pStyle w:val="Heading2"/>
+      </w:pPr>
+      <w:r>
+        <w:t>§6.3 勘误与失误记录（2026-08-17 补充）</w:t>
+      </w:r>
+    </w:p>
+    <w:p>
+      <w:pPr>
+        <w:pStyle w:val="ListBullet"/>
+      </w:pPr>
+      <w:r>
+        <w:t>M1 · K轴数值虚高（分析误用运行态脏字段）</w:t>
+      </w:r>
+    </w:p>
+    <w:p>
+      <w:r>
+        <w:t>制作 K轴/Ẇ轴分析（v1）时直接取 results/density/stage2_density_k*.json 的 details.l1_ok 重算，得 K轴 0.956–0.970（虚高约 2pp），与 docx §6.1 权威 0.902–0.950 矛盾；该 density JSON 的 collective_acc 字段本就有“运行态被实时滚动改写”前科，内部 collective_acc 与 details 自相矛盾。订正：以 docx §6.1 / 汇报 dashboard / verify_report 三源交叉验证的权威值（0.902–0.950）为准，density JSON 裸字段不再作真值，已重出修订版分析（v2）。</w:t>
+      </w:r>
+    </w:p>
+    <w:p>
+      <w:pPr>
+        <w:pStyle w:val="ListBullet"/>
+      </w:pPr>
+      <w:r>
+        <w:t>M2 · k20 误判“未完”</w:t>
+      </w:r>
+    </w:p>
+    <w:p>
+      <w:r>
+        <w:t>曾看 results/density/stage2_density_k20.json 显示 status=running、q137/500、details 空，误判 k20 未扫完。经核实该文件是 P13 休眠事故（笔记本休眠带停 ollama）中 k20 solo 段被截断、缓存清零重跑的 running 残留；真实完成结果 k20=0.940（done）完好保留在 docx §6.1、dashboard、图2。教训：残留文件≠真实状态，核验须交叉多源。</w:t>
+      </w:r>
+    </w:p>
+    <w:p>
+      <w:pPr>
+        <w:pStyle w:val="ListBullet"/>
+      </w:pPr>
+      <w:r>
+        <w:t>M3 · run_wc_scan.py 缺 import argparse 致重启崩溃</w:t>
+      </w:r>
+    </w:p>
+    <w:p>
+      <w:r>
+        <w:t>用户要求重启 Ẇ轴扫描续跑，首次启动 run_wc_scan.py 即 NameError: name 'argparse' is not defined（density 脚本有此 import，wc 脚本漏写）。已补 import argparse 一行，重启成功，断点续跑 0.5/0.6/0.8/1.0（已完成 0/0.2/0.4/0.5 真值不覆盖）。</w:t>
+      </w:r>
+    </w:p>
+    <w:p>
+      <w:pPr>
+        <w:pStyle w:val="ListBullet"/>
+      </w:pPr>
+      <w:r>
+        <w:t>M4 · Ẇ轴扫描在 Ẇ=0.4 处进程中断、重启续跑</w:t>
+      </w:r>
+    </w:p>
+    <w:p>
+      <w:r>
+        <w:t>Ẇ轴主扫描（run_wc_scan.py）驱动进程在推进入 Ẇ=0.5 前死亡，results/live/ 所有文件时间戳停在 17:27（约 1 小时无更新）；ollama 服务存活但扫描驱动不在。根因：P13 前科（笔记本休眠/进程崩溃）再现。run_wc_scan.py 含单实例锁（wc_scan.lock，死 PID 自动覆盖）+ Ollama 探活，verify_stage2 内部“题级断点续跑 + 已完成档重建”→ 重启只续跑 0.5→1.0，不覆盖已完成 0/0.2/0.4/0.5 真值。已后台重启（19:09 仍 running，Solo l3_0 q445/500）。</w:t>
+      </w:r>
+    </w:p>
+    <w:p>
+      <w:pPr>
+        <w:pStyle w:val="ListBullet"/>
+      </w:pPr>
+      <w:r>
+        <w:t>M5 · 状态汇报误用滞后镜像</w:t>
+      </w:r>
+    </w:p>
+    <w:p>
+      <w:r>
+        <w:t>18:36 状态汇报称“Ẇ=0.5 未完、仅 3 节点”，依据是 results/live/w_level_truth.json（仅 0/0.2/0.4）；但 canonical 文件 results/density/w_level_truth.json 当时已含 0.5=0.968（共 4 节点）。教训：核验以 canonical 文件为准，live/ 镜可能滞后/残留。</w:t>
       </w:r>
     </w:p>
     <w:p>

</xml_diff>